<commit_message>
feat: add real-data KOIL morphology endpoint
Train and lock-test an independent SIPaKMeD KOIL model with cluster-disjoint splits, confidence intervals, calibration, error analysis, and endpoint-specific Grad-CAM. Integrate the model into API/report safety gates, deployment readiness, the Anong web UI, and WSEEC evidence while preserving the HPV and ThinPrep claim boundaries.
</commit_message>
<xml_diff>
--- a/docs/wseec_2026/CerviCo_Pilot_WSEEC_2026_Full_Paper_Polished.docx
+++ b/docs/wseec_2026/CerviCo_Pilot_WSEEC_2026_Full_Paper_Polished.docx
@@ -930,7 +930,7 @@
           <w:color w:val="15242E"/>
           <w:sz w:val="24"/>
         </w:rPr>
-        <w:t>Cervical cancer is largely preventable when screening, interpretation, communication, and follow-up operate as a continuous pathway. This study developed CerviCo-Pilot, an explainable and uncertainty-aware research prototype for clinician-in-the-loop cervical cytology screening support. The system combines a Bethesda-style five-class output (NILM, LSIL, HSIL, SCC, and a KOIL placeholder), a binary normal/abnormal safety-triage view, Grad-CAM visual review support, Monte Carlo Dropout uncertainty, and a report lock that requires clinician sign-off before patient-facing communication. An EfficientNet-B0 model was trained and evaluated using 917 real images from the public Herlev cervical cytology dataset; segmentation masks were excluded from performance evidence. On the held-out test set (n=137), five-class accuracy was 0.6934, macro F1 was 0.5545, macro AUROC was 0.7311, and quadratic weighted kappa was 0.687. The binary safety-triage view achieved sensitivity 1.000, specificity 0.7222, AUROC 0.964, AUPRC 0.9856, and a confusion matrix of TP=101, TN=26, FP=10, and FN=0. Five-fold cross-validation produced binary sensitivity of 0.9867 +/- 0.0086 and AUROC of 0.9435 +/- 0.0448. Post-hoc temperature scaling improved held-out calibration metrics without materially changing discrimination. The prototype demonstrates a complete review workflow rather than an autonomous diagnostic device. Its present evidence is limited to the Herlev domain; it does not replace molecular HPV testing, and Thai ThinPrep validation, paired HPV endpoints, reader studies, and prospective evaluation remain necessary before clinical use.</w:t>
+        <w:t>Cervical cancer is largely preventable when screening, interpretation, communication, and follow-up operate as a continuous pathway. This study developed CerviCo-Pilot, an explainable and uncertainty-aware research prototype for clinician-in-the-loop cervical cytology screening support. The system separates a four-class cytology-grade output (NILM, LSIL, HSIL, and SCC) from an independent koilocytosis-morphology endpoint, and adds a binary normal/abnormal safety-triage view, Grad-CAM visual review support, Monte Carlo Dropout uncertainty, and a report lock that requires clinician sign-off before patient-facing communication. An EfficientNet-B0 grade model was trained and evaluated using 917 real images from the public Herlev cervical cytology dataset; segmentation masks were excluded from performance evidence. On the held-out test set (n=137), the legacy five-output evaluation had accuracy 0.6934, macro F1 0.5545, macro AUROC was 0.7311, and quadratic weighted kappa was 0.687. The binary safety-triage view achieved sensitivity 1.000, specificity 0.7222, AUROC 0.964, AUPRC 0.9856, and a confusion matrix of TP=101, TN=26, FP=10, and FN=0. Five-fold cross-validation produced binary sensitivity of 0.9867 +/- 0.0086 and AUROC of 0.9435 +/- 0.0448. Post-hoc temperature scaling improved held-out calibration metrics without materially changing discrimination. For the separate KOIL endpoint, EfficientNet-B0 was trained on all 4,049 official SIPaKMeD cropped cells using source-cluster-disjoint splits. On the locked test set (641 cells; 133 KOIL-positive), sensitivity was 0.9624, specificity 0.9764, AUROC 0.9912, AUPRC 0.9810, and ECE 0.0134; cluster-bootstrap 95% confidence intervals were 0.9167-0.9921 for sensitivity and 0.9583-0.9916 for specificity. The prototype demonstrates a complete review workflow rather than an autonomous diagnostic device. Herlev and SIPaKMeD are public conventional cytology domains; the system does not replace molecular HPV testing, and Thai ThinPrep validation, paired HPV endpoints, reader studies, and prospective evaluation remain necessary before clinical use.</w:t>
       </w:r>
     </w:p>
     <w:p>
@@ -955,7 +955,7 @@
           <w:color w:val="15242E"/>
           <w:sz w:val="24"/>
         </w:rPr>
-        <w:t>cervical cytology, explainable artificial intelligence, uncertainty-aware triage, Grad-CAM, clinician-in-the-loop, ThinPrep</w:t>
+        <w:t>cervical cytology, explainable artificial intelligence, uncertainty-aware triage, Grad-CAM, clinician-in-the-loop, ThinPrep, koilocytosis</w:t>
       </w:r>
     </w:p>
     <w:tbl>
@@ -1004,7 +1004,7 @@
                 <w:color w:val="15242E"/>
                 <w:sz w:val="21"/>
               </w:rPr>
-              <w:t>The present evidence is limited to the public Herlev domain. HPV output means morphology-related risk communication and does not replace molecular HPV testing.</w:t>
+              <w:t>Grade and triage evidence comes from Herlev; KOIL morphology evidence comes from SIPaKMeD conventional Pap-smear crops. Neither is Thai ThinPrep validation or molecular HPV testing.</w:t>
             </w:r>
           </w:p>
         </w:tc>
@@ -1188,7 +1188,7 @@
           <w:color w:val="15242E"/>
           <w:sz w:val="24"/>
         </w:rPr>
-        <w:t>Develop a Bethesda-style five-class cervical cytology screening-support model.</w:t>
+        <w:t>Develop a four-class Bethesda-style cervical cytology grading model.</w:t>
       </w:r>
     </w:p>
     <w:p>
@@ -1202,7 +1202,21 @@
           <w:color w:val="15242E"/>
           <w:sz w:val="24"/>
         </w:rPr>
-        <w:t>Add a high-sensitivity binary safety-triage view without replacing the five-class output.</w:t>
+        <w:t>Develop a separate koilocytosis-morphology endpoint without treating KOIL as a Bethesda grade.</w:t>
+      </w:r>
+    </w:p>
+    <w:p>
+      <w:pPr>
+        <w:pStyle w:val="ListBullet"/>
+        <w:spacing w:line="240" w:lineRule="auto" w:after="20"/>
+      </w:pPr>
+      <w:r>
+        <w:rPr>
+          <w:rFonts w:ascii="Arial" w:hAnsi="Arial" w:eastAsia="Arial" w:cs="Arial"/>
+          <w:color w:val="15242E"/>
+          <w:sz w:val="24"/>
+        </w:rPr>
+        <w:t>Add a high-sensitivity binary safety-triage view without replacing the grade output.</w:t>
       </w:r>
     </w:p>
     <w:p>
@@ -1411,7 +1425,7 @@
           <w:color w:val="15242E"/>
           <w:sz w:val="24"/>
         </w:rPr>
-        <w:t>The Herlev benchmark contains 917 single-cell cervical cytology images [5]. EfficientNet provides an efficient scaling strategy for image models [6], making EfficientNet-B0 suitable for an offline prototype. Grad-CAM localizes regions associated with a class score [7], but it remains a review aid rather than causal proof.</w:t>
+        <w:t>The Herlev benchmark contains 917 single-cell cervical cytology images [5]. SIPaKMeD provides 4,049 cropped cells from 966 source cluster images across five morphology classes, including 825 koilocytotic cells [14]. EfficientNet provides an efficient scaling strategy for offline image models [6]. Grad-CAM localizes regions associated with a class score [7], but it remains a review aid rather than causal proof.</w:t>
       </w:r>
     </w:p>
     <w:p>
@@ -1620,7 +1634,7 @@
                 <w:color w:val="15242E"/>
                 <w:sz w:val="17"/>
               </w:rPr>
-              <w:t>Five-class Bethesda-style suggestion</w:t>
+              <w:t>Four-class Bethesda-style grade</w:t>
             </w:r>
           </w:p>
         </w:tc>
@@ -1673,7 +1687,7 @@
                 <w:color w:val="15242E"/>
                 <w:sz w:val="17"/>
               </w:rPr>
-              <w:t>Screening safety</w:t>
+              <w:t>KOIL morphology</w:t>
             </w:r>
           </w:p>
         </w:tc>
@@ -1699,6 +1713,84 @@
                 <w:color w:val="15242E"/>
                 <w:sz w:val="17"/>
               </w:rPr>
+              <w:t>Independent one-vs-rest endpoint</w:t>
+            </w:r>
+          </w:p>
+        </w:tc>
+        <w:tc>
+          <w:tcPr>
+            <w:tcW w:type="dxa" w:w="2778"/>
+            <w:shd w:fill="F5F8F9"/>
+            <w:tcMar>
+              <w:top w:w="80" w:type="dxa"/>
+              <w:start w:w="90" w:type="dxa"/>
+              <w:bottom w:w="80" w:type="dxa"/>
+              <w:end w:w="90" w:type="dxa"/>
+            </w:tcMar>
+            <w:vAlign w:val="center"/>
+          </w:tcPr>
+          <w:p>
+            <w:pPr>
+              <w:spacing w:line="240" w:lineRule="auto" w:after="0"/>
+            </w:pPr>
+            <w:r>
+              <w:rPr>
+                <w:rFonts w:ascii="Arial" w:hAnsi="Arial" w:eastAsia="Arial" w:cs="Arial"/>
+                <w:color w:val="15242E"/>
+                <w:sz w:val="17"/>
+              </w:rPr>
+              <w:t>Not HPV DNA/RNA status</w:t>
+            </w:r>
+          </w:p>
+        </w:tc>
+      </w:tr>
+      <w:tr>
+        <w:tc>
+          <w:tcPr>
+            <w:tcW w:type="dxa" w:w="1757"/>
+            <w:tcMar>
+              <w:top w:w="80" w:type="dxa"/>
+              <w:start w:w="90" w:type="dxa"/>
+              <w:bottom w:w="80" w:type="dxa"/>
+              <w:end w:w="90" w:type="dxa"/>
+            </w:tcMar>
+            <w:vAlign w:val="center"/>
+          </w:tcPr>
+          <w:p>
+            <w:pPr>
+              <w:spacing w:line="240" w:lineRule="auto" w:after="0"/>
+            </w:pPr>
+            <w:r>
+              <w:rPr>
+                <w:rFonts w:ascii="Arial" w:hAnsi="Arial" w:eastAsia="Arial" w:cs="Arial"/>
+                <w:color w:val="15242E"/>
+                <w:sz w:val="17"/>
+              </w:rPr>
+              <w:t>Screening safety</w:t>
+            </w:r>
+          </w:p>
+        </w:tc>
+        <w:tc>
+          <w:tcPr>
+            <w:tcW w:type="dxa" w:w="3402"/>
+            <w:tcMar>
+              <w:top w:w="80" w:type="dxa"/>
+              <w:start w:w="90" w:type="dxa"/>
+              <w:bottom w:w="80" w:type="dxa"/>
+              <w:end w:w="90" w:type="dxa"/>
+            </w:tcMar>
+            <w:vAlign w:val="center"/>
+          </w:tcPr>
+          <w:p>
+            <w:pPr>
+              <w:spacing w:line="240" w:lineRule="auto" w:after="0"/>
+            </w:pPr>
+            <w:r>
+              <w:rPr>
+                <w:rFonts w:ascii="Arial" w:hAnsi="Arial" w:eastAsia="Arial" w:cs="Arial"/>
+                <w:color w:val="15242E"/>
+                <w:sz w:val="17"/>
+              </w:rPr>
               <w:t>Binary normal/abnormal triage</w:t>
             </w:r>
           </w:p>
@@ -1706,7 +1798,6 @@
         <w:tc>
           <w:tcPr>
             <w:tcW w:type="dxa" w:w="2778"/>
-            <w:shd w:fill="F5F8F9"/>
             <w:tcMar>
               <w:top w:w="80" w:type="dxa"/>
               <w:start w:w="90" w:type="dxa"/>
@@ -1734,6 +1825,7 @@
         <w:tc>
           <w:tcPr>
             <w:tcW w:type="dxa" w:w="1757"/>
+            <w:shd w:fill="F5F8F9"/>
             <w:tcMar>
               <w:top w:w="80" w:type="dxa"/>
               <w:start w:w="90" w:type="dxa"/>
@@ -1759,6 +1851,7 @@
         <w:tc>
           <w:tcPr>
             <w:tcW w:type="dxa" w:w="3402"/>
+            <w:shd w:fill="F5F8F9"/>
             <w:tcMar>
               <w:top w:w="80" w:type="dxa"/>
               <w:start w:w="90" w:type="dxa"/>
@@ -1784,6 +1877,7 @@
         <w:tc>
           <w:tcPr>
             <w:tcW w:type="dxa" w:w="2778"/>
+            <w:shd w:fill="F5F8F9"/>
             <w:tcMar>
               <w:top w:w="80" w:type="dxa"/>
               <w:start w:w="90" w:type="dxa"/>
@@ -1811,7 +1905,6 @@
         <w:tc>
           <w:tcPr>
             <w:tcW w:type="dxa" w:w="1757"/>
-            <w:shd w:fill="F5F8F9"/>
             <w:tcMar>
               <w:top w:w="80" w:type="dxa"/>
               <w:start w:w="90" w:type="dxa"/>
@@ -1837,7 +1930,6 @@
         <w:tc>
           <w:tcPr>
             <w:tcW w:type="dxa" w:w="3402"/>
-            <w:shd w:fill="F5F8F9"/>
             <w:tcMar>
               <w:top w:w="80" w:type="dxa"/>
               <w:start w:w="90" w:type="dxa"/>
@@ -1863,7 +1955,6 @@
         <w:tc>
           <w:tcPr>
             <w:tcW w:type="dxa" w:w="2778"/>
-            <w:shd w:fill="F5F8F9"/>
             <w:tcMar>
               <w:top w:w="80" w:type="dxa"/>
               <w:start w:w="90" w:type="dxa"/>
@@ -1891,6 +1982,7 @@
         <w:tc>
           <w:tcPr>
             <w:tcW w:type="dxa" w:w="1757"/>
+            <w:shd w:fill="F5F8F9"/>
             <w:tcMar>
               <w:top w:w="80" w:type="dxa"/>
               <w:start w:w="90" w:type="dxa"/>
@@ -1916,6 +2008,7 @@
         <w:tc>
           <w:tcPr>
             <w:tcW w:type="dxa" w:w="3402"/>
+            <w:shd w:fill="F5F8F9"/>
             <w:tcMar>
               <w:top w:w="80" w:type="dxa"/>
               <w:start w:w="90" w:type="dxa"/>
@@ -1941,6 +2034,7 @@
         <w:tc>
           <w:tcPr>
             <w:tcW w:type="dxa" w:w="2778"/>
+            <w:shd w:fill="F5F8F9"/>
             <w:tcMar>
               <w:top w:w="80" w:type="dxa"/>
               <w:start w:w="90" w:type="dxa"/>
@@ -2078,7 +2172,7 @@
           <w:color w:val="15242E"/>
           <w:sz w:val="24"/>
         </w:rPr>
-        <w:t>This retrospective model-development and prototype-integration study used 917 real images from the public Herlev cervical cytology dataset [5]. Segmentation-mask files and synthetic-heavy historical experiments were excluded from public performance evidence. The held-out test set contained 137 images.</w:t>
+        <w:t>This retrospective model-development and prototype-integration study used two public datasets. Grade and binary-triage evidence used 917 real Herlev images [5], with segmentation masks and synthetic experiments excluded. The independent KOIL endpoint used all 4,049 official SIPaKMeD cropped cells from 966 source clusters [14].</w:t>
       </w:r>
     </w:p>
     <w:p>
@@ -2200,7 +2294,7 @@
                 <w:color w:val="15242E"/>
                 <w:sz w:val="18"/>
               </w:rPr>
-              <w:t>Dataset</w:t>
+              <w:t>Grade/triage dataset</w:t>
             </w:r>
           </w:p>
         </w:tc>
@@ -2225,7 +2319,7 @@
                 <w:color w:val="15242E"/>
                 <w:sz w:val="18"/>
               </w:rPr>
-              <w:t>Herlev public cervical cytology dataset</w:t>
+              <w:t>Herlev: 917 real images; masks excluded</w:t>
             </w:r>
           </w:p>
         </w:tc>
@@ -2253,7 +2347,7 @@
                 <w:color w:val="15242E"/>
                 <w:sz w:val="18"/>
               </w:rPr>
-              <w:t>Images</w:t>
+              <w:t>KOIL dataset</w:t>
             </w:r>
           </w:p>
         </w:tc>
@@ -2279,7 +2373,7 @@
                 <w:color w:val="15242E"/>
                 <w:sz w:val="18"/>
               </w:rPr>
-              <w:t>917 real images; masks excluded</w:t>
+              <w:t>SIPaKMeD: 4,049 cells from 966 source clusters</w:t>
             </w:r>
           </w:p>
         </w:tc>
@@ -2359,7 +2453,7 @@
                 <w:color w:val="15242E"/>
                 <w:sz w:val="18"/>
               </w:rPr>
-              <w:t>Five-class output</w:t>
+              <w:t>Grade output</w:t>
             </w:r>
           </w:p>
         </w:tc>
@@ -2385,7 +2479,7 @@
                 <w:color w:val="15242E"/>
                 <w:sz w:val="18"/>
               </w:rPr>
-              <w:t>NILM, LSIL, HSIL, SCC, KOIL placeholder</w:t>
+              <w:t>NILM, LSIL, HSIL, SCC</w:t>
             </w:r>
           </w:p>
         </w:tc>
@@ -2412,7 +2506,7 @@
                 <w:color w:val="15242E"/>
                 <w:sz w:val="18"/>
               </w:rPr>
-              <w:t>Binary triage</w:t>
+              <w:t>KOIL output</w:t>
             </w:r>
           </w:p>
         </w:tc>
@@ -2437,7 +2531,7 @@
                 <w:color w:val="15242E"/>
                 <w:sz w:val="18"/>
               </w:rPr>
-              <w:t>NILM=normal; remaining classes=abnormal</w:t>
+              <w:t>Independent koilocytosis morphology probability</w:t>
             </w:r>
           </w:p>
         </w:tc>
@@ -2491,7 +2585,7 @@
                 <w:color w:val="15242E"/>
                 <w:sz w:val="18"/>
               </w:rPr>
-              <w:t>Phase 1 Herlev-only research prototype</w:t>
+              <w:t>Internal public-dataset validation; no Thai ThinPrep evidence</w:t>
             </w:r>
           </w:p>
         </w:tc>
@@ -2542,7 +2636,7 @@
           <w:color w:val="15242E"/>
           <w:sz w:val="24"/>
         </w:rPr>
-        <w:t>The workflow accepts a cytology image, returns five-class probabilities and a binary triage interpretation, generates a Grad-CAM overlay, estimates uncertainty, and routes the result to clinician confirmation, correction, or rejection. A patient-facing report remains locked when the case is uncertain or unsigned.</w:t>
+        <w:t>The workflow accepts a cytology image, returns four grade probabilities, binary triage, and an independent KOIL morphology assessment. Grade and KOIL use class-specific Grad-CAM review. Uncertainty and image-quality gates route unsafe cases to clinician confirmation, correction, or rejection; patient-facing output remains locked until all gates pass.</w:t>
       </w:r>
     </w:p>
     <w:p>
@@ -2700,7 +2794,7 @@
           <w:color w:val="15242E"/>
           <w:sz w:val="24"/>
         </w:rPr>
-        <w:t>Images were resized for EfficientNet-B0 input and processed through the canonical project pipeline. Transfer learning, class-aware training, focal-loss experiments, oversampling, and test-time augmentation were used to address limited data and class imbalance. Only metrics reproduced from models/best_cervical.pt are used in this paper.</w:t>
+        <w:t>Images were resized for EfficientNet-B0 input and processed through canonical pipelines. Herlev grade/triage metrics were reproduced from models/best_cervical.pt. For SIPaKMeD, source clusters were split before training (676/145/145 clusters for train/validation/test), preventing cropped cells from the same cluster crossing splits. Model selection, temperature scaling, and a sensitivity-constrained KOIL threshold were fixed on validation data before one-time test evaluation.</w:t>
       </w:r>
     </w:p>
     <w:p>
@@ -2929,7 +3023,7 @@
                 <w:color w:val="15242E"/>
                 <w:sz w:val="17"/>
               </w:rPr>
-              <w:t>Bootstrap</w:t>
+              <w:t>KOIL locked test</w:t>
             </w:r>
           </w:p>
         </w:tc>
@@ -2955,6 +3049,84 @@
                 <w:color w:val="15242E"/>
                 <w:sz w:val="17"/>
               </w:rPr>
+              <w:t>641 cells; 145 clusters</w:t>
+            </w:r>
+          </w:p>
+        </w:tc>
+        <w:tc>
+          <w:tcPr>
+            <w:tcW w:type="dxa" w:w="2891"/>
+            <w:shd w:fill="F5F8F9"/>
+            <w:tcMar>
+              <w:top w:w="80" w:type="dxa"/>
+              <w:start w:w="90" w:type="dxa"/>
+              <w:bottom w:w="80" w:type="dxa"/>
+              <w:end w:w="90" w:type="dxa"/>
+            </w:tcMar>
+            <w:vAlign w:val="center"/>
+          </w:tcPr>
+          <w:p>
+            <w:pPr>
+              <w:spacing w:line="240" w:lineRule="auto" w:after="0"/>
+            </w:pPr>
+            <w:r>
+              <w:rPr>
+                <w:rFonts w:ascii="Arial" w:hAnsi="Arial" w:eastAsia="Arial" w:cs="Arial"/>
+                <w:color w:val="15242E"/>
+                <w:sz w:val="17"/>
+              </w:rPr>
+              <w:t>Independent endpoint evidence</w:t>
+            </w:r>
+          </w:p>
+        </w:tc>
+      </w:tr>
+      <w:tr>
+        <w:tc>
+          <w:tcPr>
+            <w:tcW w:type="dxa" w:w="1984"/>
+            <w:tcMar>
+              <w:top w:w="80" w:type="dxa"/>
+              <w:start w:w="90" w:type="dxa"/>
+              <w:bottom w:w="80" w:type="dxa"/>
+              <w:end w:w="90" w:type="dxa"/>
+            </w:tcMar>
+            <w:vAlign w:val="center"/>
+          </w:tcPr>
+          <w:p>
+            <w:pPr>
+              <w:spacing w:line="240" w:lineRule="auto" w:after="0"/>
+            </w:pPr>
+            <w:r>
+              <w:rPr>
+                <w:rFonts w:ascii="Arial" w:hAnsi="Arial" w:eastAsia="Arial" w:cs="Arial"/>
+                <w:color w:val="15242E"/>
+                <w:sz w:val="17"/>
+              </w:rPr>
+              <w:t>Bootstrap</w:t>
+            </w:r>
+          </w:p>
+        </w:tc>
+        <w:tc>
+          <w:tcPr>
+            <w:tcW w:type="dxa" w:w="3061"/>
+            <w:tcMar>
+              <w:top w:w="80" w:type="dxa"/>
+              <w:start w:w="90" w:type="dxa"/>
+              <w:bottom w:w="80" w:type="dxa"/>
+              <w:end w:w="90" w:type="dxa"/>
+            </w:tcMar>
+            <w:vAlign w:val="center"/>
+          </w:tcPr>
+          <w:p>
+            <w:pPr>
+              <w:spacing w:line="240" w:lineRule="auto" w:after="0"/>
+            </w:pPr>
+            <w:r>
+              <w:rPr>
+                <w:rFonts w:ascii="Arial" w:hAnsi="Arial" w:eastAsia="Arial" w:cs="Arial"/>
+                <w:color w:val="15242E"/>
+                <w:sz w:val="17"/>
+              </w:rPr>
               <w:t>2,000 percentile resamples</w:t>
             </w:r>
           </w:p>
@@ -2962,7 +3134,6 @@
         <w:tc>
           <w:tcPr>
             <w:tcW w:type="dxa" w:w="2891"/>
-            <w:shd w:fill="F5F8F9"/>
             <w:tcMar>
               <w:top w:w="80" w:type="dxa"/>
               <w:start w:w="90" w:type="dxa"/>
@@ -2990,6 +3161,7 @@
         <w:tc>
           <w:tcPr>
             <w:tcW w:type="dxa" w:w="1984"/>
+            <w:shd w:fill="F5F8F9"/>
             <w:tcMar>
               <w:top w:w="80" w:type="dxa"/>
               <w:start w:w="90" w:type="dxa"/>
@@ -3015,6 +3187,7 @@
         <w:tc>
           <w:tcPr>
             <w:tcW w:type="dxa" w:w="3061"/>
+            <w:shd w:fill="F5F8F9"/>
             <w:tcMar>
               <w:top w:w="80" w:type="dxa"/>
               <w:start w:w="90" w:type="dxa"/>
@@ -3040,6 +3213,7 @@
         <w:tc>
           <w:tcPr>
             <w:tcW w:type="dxa" w:w="2891"/>
+            <w:shd w:fill="F5F8F9"/>
             <w:tcMar>
               <w:top w:w="80" w:type="dxa"/>
               <w:start w:w="90" w:type="dxa"/>
@@ -3067,7 +3241,6 @@
         <w:tc>
           <w:tcPr>
             <w:tcW w:type="dxa" w:w="1984"/>
-            <w:shd w:fill="F5F8F9"/>
             <w:tcMar>
               <w:top w:w="80" w:type="dxa"/>
               <w:start w:w="90" w:type="dxa"/>
@@ -3093,7 +3266,6 @@
         <w:tc>
           <w:tcPr>
             <w:tcW w:type="dxa" w:w="3061"/>
-            <w:shd w:fill="F5F8F9"/>
             <w:tcMar>
               <w:top w:w="80" w:type="dxa"/>
               <w:start w:w="90" w:type="dxa"/>
@@ -3119,7 +3291,6 @@
         <w:tc>
           <w:tcPr>
             <w:tcW w:type="dxa" w:w="2891"/>
-            <w:shd w:fill="F5F8F9"/>
             <w:tcMar>
               <w:top w:w="80" w:type="dxa"/>
               <w:start w:w="90" w:type="dxa"/>
@@ -3147,6 +3318,7 @@
         <w:tc>
           <w:tcPr>
             <w:tcW w:type="dxa" w:w="1984"/>
+            <w:shd w:fill="F5F8F9"/>
             <w:tcMar>
               <w:top w:w="80" w:type="dxa"/>
               <w:start w:w="90" w:type="dxa"/>
@@ -3172,6 +3344,7 @@
         <w:tc>
           <w:tcPr>
             <w:tcW w:type="dxa" w:w="3061"/>
+            <w:shd w:fill="F5F8F9"/>
             <w:tcMar>
               <w:top w:w="80" w:type="dxa"/>
               <w:start w:w="90" w:type="dxa"/>
@@ -3197,6 +3370,7 @@
         <w:tc>
           <w:tcPr>
             <w:tcW w:type="dxa" w:w="2891"/>
+            <w:shd w:fill="F5F8F9"/>
             <w:tcMar>
               <w:top w:w="80" w:type="dxa"/>
               <w:start w:w="90" w:type="dxa"/>
@@ -3216,6 +3390,83 @@
                 <w:sz w:val="17"/>
               </w:rPr>
               <w:t>Post-hoc probability scaling</w:t>
+            </w:r>
+          </w:p>
+        </w:tc>
+      </w:tr>
+      <w:tr>
+        <w:tc>
+          <w:tcPr>
+            <w:tcW w:type="dxa" w:w="1984"/>
+            <w:tcMar>
+              <w:top w:w="80" w:type="dxa"/>
+              <w:start w:w="90" w:type="dxa"/>
+              <w:bottom w:w="80" w:type="dxa"/>
+              <w:end w:w="90" w:type="dxa"/>
+            </w:tcMar>
+            <w:vAlign w:val="center"/>
+          </w:tcPr>
+          <w:p>
+            <w:pPr>
+              <w:spacing w:line="240" w:lineRule="auto" w:after="0"/>
+            </w:pPr>
+            <w:r>
+              <w:rPr>
+                <w:rFonts w:ascii="Arial" w:hAnsi="Arial" w:eastAsia="Arial" w:cs="Arial"/>
+                <w:color w:val="15242E"/>
+                <w:sz w:val="17"/>
+              </w:rPr>
+              <w:t>KOIL calibration</w:t>
+            </w:r>
+          </w:p>
+        </w:tc>
+        <w:tc>
+          <w:tcPr>
+            <w:tcW w:type="dxa" w:w="3061"/>
+            <w:tcMar>
+              <w:top w:w="80" w:type="dxa"/>
+              <w:start w:w="90" w:type="dxa"/>
+              <w:bottom w:w="80" w:type="dxa"/>
+              <w:end w:w="90" w:type="dxa"/>
+            </w:tcMar>
+            <w:vAlign w:val="center"/>
+          </w:tcPr>
+          <w:p>
+            <w:pPr>
+              <w:spacing w:line="240" w:lineRule="auto" w:after="0"/>
+            </w:pPr>
+            <w:r>
+              <w:rPr>
+                <w:rFonts w:ascii="Arial" w:hAnsi="Arial" w:eastAsia="Arial" w:cs="Arial"/>
+                <w:color w:val="15242E"/>
+                <w:sz w:val="17"/>
+              </w:rPr>
+              <w:t>Temperature=0.838126</w:t>
+            </w:r>
+          </w:p>
+        </w:tc>
+        <w:tc>
+          <w:tcPr>
+            <w:tcW w:type="dxa" w:w="2891"/>
+            <w:tcMar>
+              <w:top w:w="80" w:type="dxa"/>
+              <w:start w:w="90" w:type="dxa"/>
+              <w:bottom w:w="80" w:type="dxa"/>
+              <w:end w:w="90" w:type="dxa"/>
+            </w:tcMar>
+            <w:vAlign w:val="center"/>
+          </w:tcPr>
+          <w:p>
+            <w:pPr>
+              <w:spacing w:line="240" w:lineRule="auto" w:after="0"/>
+            </w:pPr>
+            <w:r>
+              <w:rPr>
+                <w:rFonts w:ascii="Arial" w:hAnsi="Arial" w:eastAsia="Arial" w:cs="Arial"/>
+                <w:color w:val="15242E"/>
+                <w:sz w:val="17"/>
+              </w:rPr>
+              <w:t>Validation-fit; test locked</w:t>
             </w:r>
           </w:p>
         </w:tc>
@@ -3423,7 +3674,7 @@
           <w:color w:val="15242E"/>
           <w:sz w:val="24"/>
         </w:rPr>
-        <w:t>Five-class evaluation included accuracy, macro F1, macro AUROC, per-class recall, and quadratic weighted kappa. Binary triage included sensitivity, specificity, AUROC, AUPRC, MCC, and confusion counts. Calibration used ECE and Brier score. High uncertainty triggers abstention language and blocks patient-report release.</w:t>
+        <w:t>Legacy grade evaluation included accuracy, macro F1, macro AUROC, per-class recall, and quadratic weighted kappa. Binary triage and KOIL one-vs-rest evaluation included sensitivity, specificity, AUROC, AUPRC, precision, F1, and confusion counts. KOIL confidence intervals used 2,000 source-cluster bootstrap resamples. Calibration used ECE and Brier score. High uncertainty triggers abstention and blocks patient-report release.</w:t>
       </w:r>
     </w:p>
     <w:p>
@@ -3456,7 +3707,7 @@
           <w:color w:val="15242E"/>
           <w:sz w:val="24"/>
         </w:rPr>
-        <w:t>The React/FastAPI prototype supports sample review, image upload, Grad-CAM display, confirm/edit/reject actions, report preview, evidence download, and an audit demonstration. It is intended for supervised research demonstration and does not satisfy regulated clinical deployment requirements.</w:t>
+        <w:t>The React/FastAPI prototype supports sample review, image upload, separate grade and KOIL probabilities, class-specific Grad-CAM, confirm/edit/reject actions, report export, and an audit demonstration. It is intended for supervised research demonstration and does not satisfy regulated clinical deployment requirements.</w:t>
       </w:r>
     </w:p>
     <w:tbl>
@@ -3744,7 +3995,7 @@
                 <w:color w:val="15242E"/>
                 <w:sz w:val="17"/>
               </w:rPr>
-              <w:t>Five-class accuracy</w:t>
+              <w:t>Legacy five-output accuracy</w:t>
             </w:r>
           </w:p>
         </w:tc>
@@ -3794,7 +4045,7 @@
                 <w:color w:val="15242E"/>
                 <w:sz w:val="17"/>
               </w:rPr>
-              <w:t>Moderate detailed grading</w:t>
+              <w:t>KOIL unsupported in Herlev</w:t>
             </w:r>
           </w:p>
         </w:tc>
@@ -3822,7 +4073,7 @@
                 <w:color w:val="15242E"/>
                 <w:sz w:val="17"/>
               </w:rPr>
-              <w:t>Macro F1 / macro AUROC</w:t>
+              <w:t>Legacy macro F1 / AUROC</w:t>
             </w:r>
           </w:p>
         </w:tc>
@@ -3874,7 +4125,7 @@
                 <w:color w:val="15242E"/>
                 <w:sz w:val="17"/>
               </w:rPr>
-              <w:t>Class-specific limitations</w:t>
+              <w:t>Includes unsupported KOIL output</w:t>
             </w:r>
           </w:p>
         </w:tc>
@@ -4480,7 +4731,7 @@
           <w:color w:val="15242E"/>
           <w:sz w:val="24"/>
         </w:rPr>
-        <w:t>The two output layers served different purposes. Five-class grading preserved cytology detail but remained moderate, while binary triage achieved high sensitivity. The binary result should therefore be interpreted as a safety view rather than a replacement for the five-class objective.</w:t>
+        <w:t>The historical checkpoint used a five-output head, but Herlev contained no true KOIL support; the deployed interface therefore exposes only four grade classes and obtains KOIL morphology from the separate SIPaKMeD model. Binary triage achieved high sensitivity and remains a safety view rather than a replacement for detailed grade review.</w:t>
       </w:r>
     </w:p>
     <w:p>
@@ -4565,7 +4816,7 @@
           <w:color w:val="143B5E"/>
           <w:sz w:val="24"/>
         </w:rPr>
-        <w:t>4.2 Class-Specific Error Analysis</w:t>
+        <w:t>4.2 Grade Error Analysis</w:t>
       </w:r>
     </w:p>
     <w:p>
@@ -4576,7 +4827,7 @@
       <w:r>
         <w:drawing>
           <wp:inline xmlns:a="http://schemas.openxmlformats.org/drawingml/2006/main" xmlns:pic="http://schemas.openxmlformats.org/drawingml/2006/picture">
-            <wp:extent cx="3131999" cy="2556000"/>
+            <wp:extent cx="2700000" cy="1980000"/>
             <wp:docPr id="4" name="Picture 4"/>
             <wp:cNvGraphicFramePr>
               <a:graphicFrameLocks noChangeAspect="1"/>
@@ -4585,7 +4836,7 @@
               <a:graphicData uri="http://schemas.openxmlformats.org/drawingml/2006/picture">
                 <pic:pic>
                   <pic:nvPicPr>
-                    <pic:cNvPr id="0" name="confusion_matrix.png"/>
+                    <pic:cNvPr id="0" name="herlev_grade_confusion_4class.png"/>
                     <pic:cNvPicPr/>
                   </pic:nvPicPr>
                   <pic:blipFill>
@@ -4597,7 +4848,7 @@
                   <pic:spPr>
                     <a:xfrm>
                       <a:off x="0" y="0"/>
-                      <a:ext cx="3131999" cy="2556000"/>
+                      <a:ext cx="2700000" cy="1980000"/>
                     </a:xfrm>
                     <a:prstGeom prst="rect"/>
                   </pic:spPr>
@@ -4622,7 +4873,7 @@
           <w:color w:val="526773"/>
           <w:sz w:val="20"/>
         </w:rPr>
-        <w:t>Figure 4. Five-class output-space confusion matrix on the held-out test set; KOIL recall is not estimable because support is zero.</w:t>
+        <w:t>Figure 4. Herlev confusion matrix for the four supported grade classes.</w:t>
       </w:r>
     </w:p>
     <w:p>
@@ -4639,7 +4890,7 @@
           <w:color w:val="143B5E"/>
           <w:sz w:val="21"/>
         </w:rPr>
-        <w:t>Table 5. Held-out per-class recall and limitations.</w:t>
+        <w:t>Table 5. Herlev held-out per-class recall.</w:t>
       </w:r>
     </w:p>
     <w:tbl>
@@ -5196,10 +5447,169 @@
           </w:p>
         </w:tc>
       </w:tr>
+    </w:tbl>
+    <w:p>
+      <w:pPr>
+        <w:spacing w:line="240" w:lineRule="auto" w:before="0" w:after="0"/>
+        <w:jc w:val="both"/>
+      </w:pPr>
+      <w:r>
+        <w:rPr>
+          <w:rFonts w:ascii="Arial" w:hAnsi="Arial" w:eastAsia="Arial" w:cs="Arial"/>
+          <w:b w:val="0"/>
+          <w:i w:val="0"/>
+          <w:color w:val="15242E"/>
+          <w:sz w:val="24"/>
+        </w:rPr>
+      </w:r>
+    </w:p>
+    <w:p>
+      <w:pPr>
+        <w:keepNext/>
+        <w:spacing w:line="240" w:lineRule="auto" w:before="80" w:after="40"/>
+        <w:jc w:val="left"/>
+      </w:pPr>
+      <w:r>
+        <w:rPr>
+          <w:rFonts w:ascii="Arial" w:hAnsi="Arial" w:eastAsia="Arial" w:cs="Arial"/>
+          <w:b/>
+          <w:i w:val="0"/>
+          <w:color w:val="143B5E"/>
+          <w:sz w:val="24"/>
+        </w:rPr>
+        <w:t>4.3 Independent KOIL Morphology Endpoint</w:t>
+      </w:r>
+    </w:p>
+    <w:p>
+      <w:pPr>
+        <w:keepNext/>
+        <w:spacing w:line="240" w:lineRule="auto" w:before="60" w:after="40"/>
+        <w:jc w:val="center"/>
+      </w:pPr>
+      <w:r>
+        <w:rPr>
+          <w:rFonts w:ascii="Arial" w:hAnsi="Arial" w:eastAsia="Arial" w:cs="Arial"/>
+          <w:b/>
+          <w:i w:val="0"/>
+          <w:color w:val="143B5E"/>
+          <w:sz w:val="21"/>
+        </w:rPr>
+        <w:t>Table 6. Locked SIPaKMeD KOIL one-vs-rest test results.</w:t>
+      </w:r>
+    </w:p>
+    <w:tbl>
+      <w:tblPr>
+        <w:tblW w:type="auto" w:w="0"/>
+        <w:jc w:val="center"/>
+        <w:tblLayout w:type="fixed"/>
+        <w:tblLook w:firstColumn="1" w:firstRow="1" w:lastColumn="0" w:lastRow="0" w:noHBand="0" w:noVBand="1" w:val="04A0"/>
+        <w:tblBorders>
+          <w:top w:val="single" w:sz="5" w:space="0" w:color="B8C8CF"/>
+          <w:left w:val="single" w:sz="5" w:space="0" w:color="B8C8CF"/>
+          <w:bottom w:val="single" w:sz="5" w:space="0" w:color="B8C8CF"/>
+          <w:right w:val="single" w:sz="5" w:space="0" w:color="B8C8CF"/>
+          <w:insideH w:val="single" w:sz="5" w:space="0" w:color="B8C8CF"/>
+          <w:insideV w:val="single" w:sz="5" w:space="0" w:color="B8C8CF"/>
+        </w:tblBorders>
+      </w:tblPr>
+      <w:tblGrid>
+        <w:gridCol w:w="2646"/>
+        <w:gridCol w:w="2646"/>
+        <w:gridCol w:w="2646"/>
+      </w:tblGrid>
+      <w:tr>
+        <w:trPr>
+          <w:tblHeader w:val="true"/>
+        </w:trPr>
+        <w:tc>
+          <w:tcPr>
+            <w:tcW w:type="dxa" w:w="2381"/>
+            <w:shd w:fill="0E7490"/>
+            <w:tcMar>
+              <w:top w:w="80" w:type="dxa"/>
+              <w:start w:w="90" w:type="dxa"/>
+              <w:bottom w:w="80" w:type="dxa"/>
+              <w:end w:w="90" w:type="dxa"/>
+            </w:tcMar>
+            <w:vAlign w:val="center"/>
+          </w:tcPr>
+          <w:p>
+            <w:pPr>
+              <w:spacing w:after="0"/>
+              <w:jc w:val="center"/>
+            </w:pPr>
+            <w:r>
+              <w:rPr>
+                <w:rFonts w:ascii="Arial" w:hAnsi="Arial" w:eastAsia="Arial" w:cs="Arial"/>
+                <w:b/>
+                <w:color w:val="FFFFFF"/>
+                <w:sz w:val="16"/>
+              </w:rPr>
+              <w:t>Measure</w:t>
+            </w:r>
+          </w:p>
+        </w:tc>
+        <w:tc>
+          <w:tcPr>
+            <w:tcW w:type="dxa" w:w="2381"/>
+            <w:shd w:fill="0E7490"/>
+            <w:tcMar>
+              <w:top w:w="80" w:type="dxa"/>
+              <w:start w:w="90" w:type="dxa"/>
+              <w:bottom w:w="80" w:type="dxa"/>
+              <w:end w:w="90" w:type="dxa"/>
+            </w:tcMar>
+            <w:vAlign w:val="center"/>
+          </w:tcPr>
+          <w:p>
+            <w:pPr>
+              <w:spacing w:after="0"/>
+              <w:jc w:val="center"/>
+            </w:pPr>
+            <w:r>
+              <w:rPr>
+                <w:rFonts w:ascii="Arial" w:hAnsi="Arial" w:eastAsia="Arial" w:cs="Arial"/>
+                <w:b/>
+                <w:color w:val="FFFFFF"/>
+                <w:sz w:val="16"/>
+              </w:rPr>
+              <w:t>Result</w:t>
+            </w:r>
+          </w:p>
+        </w:tc>
+        <w:tc>
+          <w:tcPr>
+            <w:tcW w:type="dxa" w:w="3175"/>
+            <w:shd w:fill="0E7490"/>
+            <w:tcMar>
+              <w:top w:w="80" w:type="dxa"/>
+              <w:start w:w="90" w:type="dxa"/>
+              <w:bottom w:w="80" w:type="dxa"/>
+              <w:end w:w="90" w:type="dxa"/>
+            </w:tcMar>
+            <w:vAlign w:val="center"/>
+          </w:tcPr>
+          <w:p>
+            <w:pPr>
+              <w:spacing w:after="0"/>
+              <w:jc w:val="center"/>
+            </w:pPr>
+            <w:r>
+              <w:rPr>
+                <w:rFonts w:ascii="Arial" w:hAnsi="Arial" w:eastAsia="Arial" w:cs="Arial"/>
+                <w:b/>
+                <w:color w:val="FFFFFF"/>
+                <w:sz w:val="16"/>
+              </w:rPr>
+              <w:t>Cluster-bootstrap 95% CI</w:t>
+            </w:r>
+          </w:p>
+        </w:tc>
+      </w:tr>
       <w:tr>
         <w:tc>
           <w:tcPr>
-            <w:tcW w:type="dxa" w:w="1361"/>
+            <w:tcW w:type="dxa" w:w="2381"/>
             <w:tcMar>
               <w:top w:w="80" w:type="dxa"/>
               <w:start w:w="90" w:type="dxa"/>
@@ -5216,15 +5626,15 @@
               <w:rPr>
                 <w:rFonts w:ascii="Arial" w:hAnsi="Arial" w:eastAsia="Arial" w:cs="Arial"/>
                 <w:color w:val="15242E"/>
-                <w:sz w:val="17"/>
+                <w:sz w:val="16"/>
               </w:rPr>
-              <w:t>KOIL</w:t>
+              <w:t>Support</w:t>
             </w:r>
           </w:p>
         </w:tc>
         <w:tc>
           <w:tcPr>
-            <w:tcW w:type="dxa" w:w="1247"/>
+            <w:tcW w:type="dxa" w:w="2381"/>
             <w:tcMar>
               <w:top w:w="80" w:type="dxa"/>
               <w:start w:w="90" w:type="dxa"/>
@@ -5241,15 +5651,15 @@
               <w:rPr>
                 <w:rFonts w:ascii="Arial" w:hAnsi="Arial" w:eastAsia="Arial" w:cs="Arial"/>
                 <w:color w:val="15242E"/>
-                <w:sz w:val="17"/>
+                <w:sz w:val="16"/>
               </w:rPr>
-              <w:t>0</w:t>
+              <w:t>133 positive / 508 negative</w:t>
             </w:r>
           </w:p>
         </w:tc>
         <w:tc>
           <w:tcPr>
-            <w:tcW w:type="dxa" w:w="1247"/>
+            <w:tcW w:type="dxa" w:w="3175"/>
             <w:tcMar>
               <w:top w:w="80" w:type="dxa"/>
               <w:start w:w="90" w:type="dxa"/>
@@ -5266,15 +5676,18 @@
               <w:rPr>
                 <w:rFonts w:ascii="Arial" w:hAnsi="Arial" w:eastAsia="Arial" w:cs="Arial"/>
                 <w:color w:val="15242E"/>
-                <w:sz w:val="17"/>
+                <w:sz w:val="16"/>
               </w:rPr>
-              <w:t>N/A</w:t>
+              <w:t>145 source clusters</w:t>
             </w:r>
           </w:p>
         </w:tc>
+      </w:tr>
+      <w:tr>
         <w:tc>
           <w:tcPr>
-            <w:tcW w:type="dxa" w:w="4082"/>
+            <w:tcW w:type="dxa" w:w="2381"/>
+            <w:shd w:fill="F5F8F9"/>
             <w:tcMar>
               <w:top w:w="80" w:type="dxa"/>
               <w:start w:w="90" w:type="dxa"/>
@@ -5291,9 +5704,218 @@
               <w:rPr>
                 <w:rFonts w:ascii="Arial" w:hAnsi="Arial" w:eastAsia="Arial" w:cs="Arial"/>
                 <w:color w:val="15242E"/>
-                <w:sz w:val="17"/>
+                <w:sz w:val="16"/>
               </w:rPr>
-              <w:t>Not estimable; no true KOIL support</w:t>
+              <w:t>Sensitivity / specificity</w:t>
+            </w:r>
+          </w:p>
+        </w:tc>
+        <w:tc>
+          <w:tcPr>
+            <w:tcW w:type="dxa" w:w="2381"/>
+            <w:shd w:fill="F5F8F9"/>
+            <w:tcMar>
+              <w:top w:w="80" w:type="dxa"/>
+              <w:start w:w="90" w:type="dxa"/>
+              <w:bottom w:w="80" w:type="dxa"/>
+              <w:end w:w="90" w:type="dxa"/>
+            </w:tcMar>
+            <w:vAlign w:val="center"/>
+          </w:tcPr>
+          <w:p>
+            <w:pPr>
+              <w:spacing w:line="240" w:lineRule="auto" w:after="0"/>
+            </w:pPr>
+            <w:r>
+              <w:rPr>
+                <w:rFonts w:ascii="Arial" w:hAnsi="Arial" w:eastAsia="Arial" w:cs="Arial"/>
+                <w:color w:val="15242E"/>
+                <w:sz w:val="16"/>
+              </w:rPr>
+              <w:t>0.9624 / 0.9764</w:t>
+            </w:r>
+          </w:p>
+        </w:tc>
+        <w:tc>
+          <w:tcPr>
+            <w:tcW w:type="dxa" w:w="3175"/>
+            <w:shd w:fill="F5F8F9"/>
+            <w:tcMar>
+              <w:top w:w="80" w:type="dxa"/>
+              <w:start w:w="90" w:type="dxa"/>
+              <w:bottom w:w="80" w:type="dxa"/>
+              <w:end w:w="90" w:type="dxa"/>
+            </w:tcMar>
+            <w:vAlign w:val="center"/>
+          </w:tcPr>
+          <w:p>
+            <w:pPr>
+              <w:spacing w:line="240" w:lineRule="auto" w:after="0"/>
+            </w:pPr>
+            <w:r>
+              <w:rPr>
+                <w:rFonts w:ascii="Arial" w:hAnsi="Arial" w:eastAsia="Arial" w:cs="Arial"/>
+                <w:color w:val="15242E"/>
+                <w:sz w:val="16"/>
+              </w:rPr>
+              <w:t>0.9167-0.9921 / 0.9583-0.9916</w:t>
+            </w:r>
+          </w:p>
+        </w:tc>
+      </w:tr>
+      <w:tr>
+        <w:tc>
+          <w:tcPr>
+            <w:tcW w:type="dxa" w:w="2381"/>
+            <w:tcMar>
+              <w:top w:w="80" w:type="dxa"/>
+              <w:start w:w="90" w:type="dxa"/>
+              <w:bottom w:w="80" w:type="dxa"/>
+              <w:end w:w="90" w:type="dxa"/>
+            </w:tcMar>
+            <w:vAlign w:val="center"/>
+          </w:tcPr>
+          <w:p>
+            <w:pPr>
+              <w:spacing w:line="240" w:lineRule="auto" w:after="0"/>
+            </w:pPr>
+            <w:r>
+              <w:rPr>
+                <w:rFonts w:ascii="Arial" w:hAnsi="Arial" w:eastAsia="Arial" w:cs="Arial"/>
+                <w:color w:val="15242E"/>
+                <w:sz w:val="16"/>
+              </w:rPr>
+              <w:t>Precision / F1</w:t>
+            </w:r>
+          </w:p>
+        </w:tc>
+        <w:tc>
+          <w:tcPr>
+            <w:tcW w:type="dxa" w:w="2381"/>
+            <w:tcMar>
+              <w:top w:w="80" w:type="dxa"/>
+              <w:start w:w="90" w:type="dxa"/>
+              <w:bottom w:w="80" w:type="dxa"/>
+              <w:end w:w="90" w:type="dxa"/>
+            </w:tcMar>
+            <w:vAlign w:val="center"/>
+          </w:tcPr>
+          <w:p>
+            <w:pPr>
+              <w:spacing w:line="240" w:lineRule="auto" w:after="0"/>
+            </w:pPr>
+            <w:r>
+              <w:rPr>
+                <w:rFonts w:ascii="Arial" w:hAnsi="Arial" w:eastAsia="Arial" w:cs="Arial"/>
+                <w:color w:val="15242E"/>
+                <w:sz w:val="16"/>
+              </w:rPr>
+              <w:t>0.9143 / 0.9377</w:t>
+            </w:r>
+          </w:p>
+        </w:tc>
+        <w:tc>
+          <w:tcPr>
+            <w:tcW w:type="dxa" w:w="3175"/>
+            <w:tcMar>
+              <w:top w:w="80" w:type="dxa"/>
+              <w:start w:w="90" w:type="dxa"/>
+              <w:bottom w:w="80" w:type="dxa"/>
+              <w:end w:w="90" w:type="dxa"/>
+            </w:tcMar>
+            <w:vAlign w:val="center"/>
+          </w:tcPr>
+          <w:p>
+            <w:pPr>
+              <w:spacing w:line="240" w:lineRule="auto" w:after="0"/>
+            </w:pPr>
+            <w:r>
+              <w:rPr>
+                <w:rFonts w:ascii="Arial" w:hAnsi="Arial" w:eastAsia="Arial" w:cs="Arial"/>
+                <w:color w:val="15242E"/>
+                <w:sz w:val="16"/>
+              </w:rPr>
+              <w:t>0.8291-0.9702 / 0.8811-0.9706</w:t>
+            </w:r>
+          </w:p>
+        </w:tc>
+      </w:tr>
+      <w:tr>
+        <w:tc>
+          <w:tcPr>
+            <w:tcW w:type="dxa" w:w="2381"/>
+            <w:shd w:fill="F5F8F9"/>
+            <w:tcMar>
+              <w:top w:w="80" w:type="dxa"/>
+              <w:start w:w="90" w:type="dxa"/>
+              <w:bottom w:w="80" w:type="dxa"/>
+              <w:end w:w="90" w:type="dxa"/>
+            </w:tcMar>
+            <w:vAlign w:val="center"/>
+          </w:tcPr>
+          <w:p>
+            <w:pPr>
+              <w:spacing w:line="240" w:lineRule="auto" w:after="0"/>
+            </w:pPr>
+            <w:r>
+              <w:rPr>
+                <w:rFonts w:ascii="Arial" w:hAnsi="Arial" w:eastAsia="Arial" w:cs="Arial"/>
+                <w:color w:val="15242E"/>
+                <w:sz w:val="16"/>
+              </w:rPr>
+              <w:t>AUROC / AUPRC</w:t>
+            </w:r>
+          </w:p>
+        </w:tc>
+        <w:tc>
+          <w:tcPr>
+            <w:tcW w:type="dxa" w:w="2381"/>
+            <w:shd w:fill="F5F8F9"/>
+            <w:tcMar>
+              <w:top w:w="80" w:type="dxa"/>
+              <w:start w:w="90" w:type="dxa"/>
+              <w:bottom w:w="80" w:type="dxa"/>
+              <w:end w:w="90" w:type="dxa"/>
+            </w:tcMar>
+            <w:vAlign w:val="center"/>
+          </w:tcPr>
+          <w:p>
+            <w:pPr>
+              <w:spacing w:line="240" w:lineRule="auto" w:after="0"/>
+            </w:pPr>
+            <w:r>
+              <w:rPr>
+                <w:rFonts w:ascii="Arial" w:hAnsi="Arial" w:eastAsia="Arial" w:cs="Arial"/>
+                <w:color w:val="15242E"/>
+                <w:sz w:val="16"/>
+              </w:rPr>
+              <w:t>0.9912 / 0.9810</w:t>
+            </w:r>
+          </w:p>
+        </w:tc>
+        <w:tc>
+          <w:tcPr>
+            <w:tcW w:type="dxa" w:w="3175"/>
+            <w:shd w:fill="F5F8F9"/>
+            <w:tcMar>
+              <w:top w:w="80" w:type="dxa"/>
+              <w:start w:w="90" w:type="dxa"/>
+              <w:bottom w:w="80" w:type="dxa"/>
+              <w:end w:w="90" w:type="dxa"/>
+            </w:tcMar>
+            <w:vAlign w:val="center"/>
+          </w:tcPr>
+          <w:p>
+            <w:pPr>
+              <w:spacing w:line="240" w:lineRule="auto" w:after="0"/>
+            </w:pPr>
+            <w:r>
+              <w:rPr>
+                <w:rFonts w:ascii="Arial" w:hAnsi="Arial" w:eastAsia="Arial" w:cs="Arial"/>
+                <w:color w:val="15242E"/>
+                <w:sz w:val="16"/>
+              </w:rPr>
+              <w:t>0.9786-0.9984 / 0.9506-0.9951</w:t>
             </w:r>
           </w:p>
         </w:tc>
@@ -5325,9 +5947,9 @@
           <w:b w:val="0"/>
           <w:i w:val="0"/>
           <w:color w:val="15242E"/>
-          <w:sz w:val="24"/>
+          <w:sz w:val="20"/>
         </w:rPr>
-        <w:t>The absence of true KOIL examples is an evidence gap, not a successful negative result. KOIL is retained only as a future target and interface placeholder. SCC recall also remains insufficient for autonomous grading.</w:t>
+        <w:t>At the validation-locked threshold of 0.3367, the model produced 128 TP, 496 TN, 12 FP, and 5 FN cells. False positives were limited to dyskeratotic (n=9) and metaplastic (n=3) morphology; each false negative came from a different source cluster. These errors require expert review and do not represent HPV test errors.</w:t>
       </w:r>
     </w:p>
     <w:p>
@@ -5412,7 +6034,7 @@
           <w:color w:val="143B5E"/>
           <w:sz w:val="24"/>
         </w:rPr>
-        <w:t>4.3 Calibration, Explainability, and System Interpretation</w:t>
+        <w:t>4.4 Calibration, Explainability, and System Interpretation</w:t>
       </w:r>
     </w:p>
     <w:p>
@@ -5429,7 +6051,7 @@
           <w:color w:val="143B5E"/>
           <w:sz w:val="21"/>
         </w:rPr>
-        <w:t>Table 6. Held-out calibration before and after temperature scaling.</w:t>
+        <w:t>Table 7. Held-out calibration evidence.</w:t>
       </w:r>
     </w:p>
     <w:tbl>
@@ -5480,7 +6102,7 @@
                 <w:color w:val="FFFFFF"/>
                 <w:sz w:val="18"/>
               </w:rPr>
-              <w:t>Measure</w:t>
+              <w:t>Endpoint / measure</w:t>
             </w:r>
           </w:p>
         </w:tc>
@@ -5798,7 +6420,7 @@
                 <w:color w:val="15242E"/>
                 <w:sz w:val="18"/>
               </w:rPr>
-              <w:t>Binary AUROC</w:t>
+              <w:t>KOIL ECE</w:t>
             </w:r>
           </w:p>
         </w:tc>
@@ -5824,7 +6446,7 @@
                 <w:color w:val="15242E"/>
                 <w:sz w:val="18"/>
               </w:rPr>
-              <w:t>0.963971</w:t>
+              <w:t>Not reported</w:t>
             </w:r>
           </w:p>
         </w:tc>
@@ -5850,7 +6472,84 @@
                 <w:color w:val="15242E"/>
                 <w:sz w:val="18"/>
               </w:rPr>
-              <w:t>0.963421</w:t>
+              <w:t>0.013385</w:t>
+            </w:r>
+          </w:p>
+        </w:tc>
+      </w:tr>
+      <w:tr>
+        <w:tc>
+          <w:tcPr>
+            <w:tcW w:type="dxa" w:w="3402"/>
+            <w:tcMar>
+              <w:top w:w="80" w:type="dxa"/>
+              <w:start w:w="90" w:type="dxa"/>
+              <w:bottom w:w="80" w:type="dxa"/>
+              <w:end w:w="90" w:type="dxa"/>
+            </w:tcMar>
+            <w:vAlign w:val="center"/>
+          </w:tcPr>
+          <w:p>
+            <w:pPr>
+              <w:spacing w:line="240" w:lineRule="auto" w:after="0"/>
+            </w:pPr>
+            <w:r>
+              <w:rPr>
+                <w:rFonts w:ascii="Arial" w:hAnsi="Arial" w:eastAsia="Arial" w:cs="Arial"/>
+                <w:color w:val="15242E"/>
+                <w:sz w:val="18"/>
+              </w:rPr>
+              <w:t>KOIL Brier score</w:t>
+            </w:r>
+          </w:p>
+        </w:tc>
+        <w:tc>
+          <w:tcPr>
+            <w:tcW w:type="dxa" w:w="2268"/>
+            <w:tcMar>
+              <w:top w:w="80" w:type="dxa"/>
+              <w:start w:w="90" w:type="dxa"/>
+              <w:bottom w:w="80" w:type="dxa"/>
+              <w:end w:w="90" w:type="dxa"/>
+            </w:tcMar>
+            <w:vAlign w:val="center"/>
+          </w:tcPr>
+          <w:p>
+            <w:pPr>
+              <w:spacing w:line="240" w:lineRule="auto" w:after="0"/>
+            </w:pPr>
+            <w:r>
+              <w:rPr>
+                <w:rFonts w:ascii="Arial" w:hAnsi="Arial" w:eastAsia="Arial" w:cs="Arial"/>
+                <w:color w:val="15242E"/>
+                <w:sz w:val="18"/>
+              </w:rPr>
+              <w:t>Not reported</w:t>
+            </w:r>
+          </w:p>
+        </w:tc>
+        <w:tc>
+          <w:tcPr>
+            <w:tcW w:type="dxa" w:w="2268"/>
+            <w:tcMar>
+              <w:top w:w="80" w:type="dxa"/>
+              <w:start w:w="90" w:type="dxa"/>
+              <w:bottom w:w="80" w:type="dxa"/>
+              <w:end w:w="90" w:type="dxa"/>
+            </w:tcMar>
+            <w:vAlign w:val="center"/>
+          </w:tcPr>
+          <w:p>
+            <w:pPr>
+              <w:spacing w:line="240" w:lineRule="auto" w:after="0"/>
+            </w:pPr>
+            <w:r>
+              <w:rPr>
+                <w:rFonts w:ascii="Arial" w:hAnsi="Arial" w:eastAsia="Arial" w:cs="Arial"/>
+                <w:color w:val="15242E"/>
+                <w:sz w:val="18"/>
+              </w:rPr>
+              <w:t>0.019025</w:t>
             </w:r>
           </w:p>
         </w:tc>
@@ -5869,6 +6568,63 @@
           <w:color w:val="15242E"/>
           <w:sz w:val="24"/>
         </w:rPr>
+      </w:r>
+    </w:p>
+    <w:p>
+      <w:pPr>
+        <w:spacing w:after="20"/>
+        <w:jc w:val="center"/>
+      </w:pPr>
+      <w:r>
+        <w:drawing>
+          <wp:inline xmlns:a="http://schemas.openxmlformats.org/drawingml/2006/main" xmlns:pic="http://schemas.openxmlformats.org/drawingml/2006/picture">
+            <wp:extent cx="4824000" cy="1296000"/>
+            <wp:docPr id="5" name="Picture 5"/>
+            <wp:cNvGraphicFramePr>
+              <a:graphicFrameLocks noChangeAspect="1"/>
+            </wp:cNvGraphicFramePr>
+            <a:graphic>
+              <a:graphicData uri="http://schemas.openxmlformats.org/drawingml/2006/picture">
+                <pic:pic>
+                  <pic:nvPicPr>
+                    <pic:cNvPr id="0" name="koil_test_performance.png"/>
+                    <pic:cNvPicPr/>
+                  </pic:nvPicPr>
+                  <pic:blipFill>
+                    <a:blip r:embed="rId15"/>
+                    <a:stretch>
+                      <a:fillRect/>
+                    </a:stretch>
+                  </pic:blipFill>
+                  <pic:spPr>
+                    <a:xfrm>
+                      <a:off x="0" y="0"/>
+                      <a:ext cx="4824000" cy="1296000"/>
+                    </a:xfrm>
+                    <a:prstGeom prst="rect"/>
+                  </pic:spPr>
+                </pic:pic>
+              </a:graphicData>
+            </a:graphic>
+          </wp:inline>
+        </w:drawing>
+      </w:r>
+    </w:p>
+    <w:p>
+      <w:pPr>
+        <w:keepNext w:val="0"/>
+        <w:spacing w:line="240" w:lineRule="auto" w:before="0" w:after="60"/>
+        <w:jc w:val="center"/>
+      </w:pPr>
+      <w:r>
+        <w:rPr>
+          <w:rFonts w:ascii="Arial" w:hAnsi="Arial" w:eastAsia="Arial" w:cs="Arial"/>
+          <w:b w:val="0"/>
+          <w:i/>
+          <w:color w:val="526773"/>
+          <w:sz w:val="20"/>
+        </w:rPr>
+        <w:t>Figure 5. SIPaKMeD morphology confusion matrix and locked-test KOIL ROC/precision-recall curves.</w:t>
       </w:r>
     </w:p>
     <w:tbl>
@@ -5903,8 +6659,8 @@
             <w:r>
               <w:drawing>
                 <wp:inline xmlns:a="http://schemas.openxmlformats.org/drawingml/2006/main" xmlns:pic="http://schemas.openxmlformats.org/drawingml/2006/picture">
-                  <wp:extent cx="2250000" cy="1674000"/>
-                  <wp:docPr id="5" name="Picture 5"/>
+                  <wp:extent cx="2250000" cy="1530000"/>
+                  <wp:docPr id="6" name="Picture 6"/>
                   <wp:cNvGraphicFramePr>
                     <a:graphicFrameLocks noChangeAspect="1"/>
                   </wp:cNvGraphicFramePr>
@@ -5916,7 +6672,7 @@
                           <pic:cNvPicPr/>
                         </pic:nvPicPr>
                         <pic:blipFill>
-                          <a:blip r:embed="rId15"/>
+                          <a:blip r:embed="rId16"/>
                           <a:stretch>
                             <a:fillRect/>
                           </a:stretch>
@@ -5924,7 +6680,7 @@
                         <pic:spPr>
                           <a:xfrm>
                             <a:off x="0" y="0"/>
-                            <a:ext cx="2250000" cy="1674000"/>
+                            <a:ext cx="2250000" cy="1530000"/>
                           </a:xfrm>
                           <a:prstGeom prst="rect"/>
                         </pic:spPr>
@@ -5948,8 +6704,8 @@
             <w:r>
               <w:drawing>
                 <wp:inline xmlns:a="http://schemas.openxmlformats.org/drawingml/2006/main" xmlns:pic="http://schemas.openxmlformats.org/drawingml/2006/picture">
-                  <wp:extent cx="2250000" cy="1674000"/>
-                  <wp:docPr id="6" name="Picture 6"/>
+                  <wp:extent cx="2250000" cy="1530000"/>
+                  <wp:docPr id="7" name="Picture 7"/>
                   <wp:cNvGraphicFramePr>
                     <a:graphicFrameLocks noChangeAspect="1"/>
                   </wp:cNvGraphicFramePr>
@@ -5957,11 +6713,11 @@
                     <a:graphicData uri="http://schemas.openxmlformats.org/drawingml/2006/picture">
                       <pic:pic>
                         <pic:nvPicPr>
-                          <pic:cNvPr id="0" name="sample_gradcam_grid.jpg"/>
+                          <pic:cNvPr id="0" name="koil_gradcam_paper.png"/>
                           <pic:cNvPicPr/>
                         </pic:nvPicPr>
                         <pic:blipFill>
-                          <a:blip r:embed="rId16"/>
+                          <a:blip r:embed="rId17"/>
                           <a:stretch>
                             <a:fillRect/>
                           </a:stretch>
@@ -5969,7 +6725,7 @@
                         <pic:spPr>
                           <a:xfrm>
                             <a:off x="0" y="0"/>
-                            <a:ext cx="2250000" cy="1674000"/>
+                            <a:ext cx="2250000" cy="1530000"/>
                           </a:xfrm>
                           <a:prstGeom prst="rect"/>
                         </pic:spPr>
@@ -6005,7 +6761,7 @@
                 <w:color w:val="526773"/>
                 <w:sz w:val="19"/>
               </w:rPr>
-              <w:t>Figure 5. Calibration comparison.</w:t>
+              <w:t>Figure 6. Herlev calibration.</w:t>
             </w:r>
           </w:p>
         </w:tc>
@@ -6031,7 +6787,7 @@
                 <w:color w:val="526773"/>
                 <w:sz w:val="19"/>
               </w:rPr>
-              <w:t>Figure 6. Cytology and Grad-CAM examples.</w:t>
+              <w:t>Figure 7. KOIL-specific Grad-CAM audit cases.</w:t>
             </w:r>
           </w:p>
         </w:tc>
@@ -6063,9 +6819,9 @@
           <w:b w:val="0"/>
           <w:i w:val="0"/>
           <w:color w:val="15242E"/>
-          <w:sz w:val="24"/>
+          <w:sz w:val="21"/>
         </w:rPr>
-        <w:t>Temperature scaling improved held-out ECE and Brier score while leaving discrimination nearly unchanged, consistent with post-hoc calibration [9]. However, calibration remains domain-dependent and cannot be extended to Thai ThinPrep images without external evidence.</w:t>
+        <w:t>Temperature scaling improved calibration without changing class ordering [9]. KOIL Grad-CAM was generated for the independent endpoint and is presented as attention evidence, not segmentation or causal proof. Calibration and attribution remain domain-dependent and cannot be extended to Thai ThinPrep images without external evidence.</w:t>
       </w:r>
     </w:p>
     <w:p>
@@ -6079,9 +6835,9 @@
           <w:b w:val="0"/>
           <w:i w:val="0"/>
           <w:color w:val="15242E"/>
-          <w:sz w:val="24"/>
+          <w:sz w:val="21"/>
         </w:rPr>
-        <w:t>The prototype's contribution is the integration of evaluation and review workflow: Grad-CAM can be challenged, uncertainty can trigger abstention, and patient communication is gated by clinician action. This aligns with human-AI interaction and transparent-reporting principles [10-12]. Dataset shift remains the principal translation risk [13].</w:t>
+        <w:t>The prototype integrates evaluation and review: explanations can be challenged, uncertainty can trigger abstention, and patient communication is gated by clinician action [10-12]. Dataset shift remains the principal translation risk [13].</w:t>
       </w:r>
     </w:p>
     <w:tbl>
@@ -6234,7 +6990,7 @@
           <w:color w:val="15242E"/>
           <w:sz w:val="24"/>
         </w:rPr>
-        <w:t>CerviCo-Pilot demonstrates an end-to-end, explainable, and uncertainty-aware cervical cytology screening-support prototype. On real Herlev images, binary triage achieved held-out sensitivity of 1.000 and AUROC of 0.964, while five-class grading achieved accuracy of 0.6934 and macro AUROC of 0.7311. These results support continued research but do not justify autonomous diagnosis or deployment.</w:t>
+        <w:t>CerviCo-Pilot demonstrates an end-to-end, explainable, and uncertainty-aware cervical cytology screening-support prototype. On Herlev, binary triage achieved held-out sensitivity 1.000 and AUROC 0.964, while the legacy five-output grade evaluation achieved accuracy 0.6934. On the separate locked SIPaKMeD test set, KOIL morphology sensitivity was 0.9624 and AUROC 0.9912. These within-dataset results support continued research but do not justify autonomous diagnosis or deployment.</w:t>
       </w:r>
     </w:p>
     <w:p>
@@ -6281,7 +7037,7 @@
           <w:color w:val="15242E"/>
           <w:sz w:val="24"/>
         </w:rPr>
-        <w:t>Evidence is restricted to a small public single-cell dataset.</w:t>
+        <w:t>Evidence is restricted to two public single-cell conventional cytology datasets.</w:t>
       </w:r>
     </w:p>
     <w:p>
@@ -6309,7 +7065,7 @@
           <w:color w:val="15242E"/>
           <w:sz w:val="24"/>
         </w:rPr>
-        <w:t>KOIL has no true support, and SCC recall remains limited.</w:t>
+        <w:t>KOIL morphology is internally validated on SIPaKMeD only; SCC grade recall remains limited.</w:t>
       </w:r>
     </w:p>
     <w:p>
@@ -6403,7 +7159,7 @@
           <w:color w:val="15242E"/>
           <w:sz w:val="24"/>
         </w:rPr>
-        <w:t>All performance values were copied from canonical project evaluation files for the shipped EfficientNet-B0 checkpoint. External sources support background and methods only; they do not create CerviCo-Pilot performance evidence.</w:t>
+        <w:t>All performance values were copied from canonical evaluation files for the shipped Herlev grade/triage and SIPaKMeD KOIL checkpoints. External sources support background and methods only; they do not create CerviCo-Pilot performance evidence.</w:t>
       </w:r>
     </w:p>
     <w:p>
@@ -6677,6 +7433,23 @@
           <w:sz w:val="18"/>
         </w:rPr>
         <w:t>[13] S. G. Finlayson et al., The clinician and dataset shift in artificial intelligence, New England Journal of Medicine, vol. 385, pp. 283-286, 2021.</w:t>
+      </w:r>
+    </w:p>
+    <w:p>
+      <w:pPr>
+        <w:spacing w:line="240" w:lineRule="auto" w:before="0" w:after="60"/>
+        <w:ind w:left="369" w:hanging="369"/>
+        <w:jc w:val="left"/>
+      </w:pPr>
+      <w:r>
+        <w:rPr>
+          <w:rFonts w:ascii="Arial" w:hAnsi="Arial" w:eastAsia="Arial" w:cs="Arial"/>
+          <w:b w:val="0"/>
+          <w:i w:val="0"/>
+          <w:color w:val="15242E"/>
+          <w:sz w:val="18"/>
+        </w:rPr>
+        <w:t>[14] M. E. Plissiti et al., SIPaKMeD: A new dataset for feature and image based classification of normal and pathological cervical cells in Pap smear images, Proc. IEEE ICIP, 2018, pp. 3144-3148.</w:t>
       </w:r>
     </w:p>
     <w:sectPr>

</xml_diff>